<commit_message>
Redacción del documento informe de entrenamiento
</commit_message>
<xml_diff>
--- a/Paper_INFONOR_Acosta_Meneses_CaCu_ML_v2.docx
+++ b/Paper_INFONOR_Acosta_Meneses_CaCu_ML_v2.docx
@@ -12086,9 +12086,956 @@
     <w:p>
       <w:pPr>
         <w:spacing w:before="220" w:after="150"/>
+        <w:jc w:val="both"/>
+        <w:rPr>
+          <w:rFonts w:ascii="Calibri" w:eastAsia="Calibri" w:hAnsi="Calibri" w:cs="Calibri"/>
+          <w:b/>
+          <w:bCs/>
+          <w:sz w:val="24"/>
+          <w:szCs w:val="24"/>
+          <w:highlight w:val="yellow"/>
+        </w:rPr>
+      </w:pPr>
+      <w:r>
+        <w:rPr>
+          <w:rFonts w:ascii="Calibri" w:eastAsia="Calibri" w:hAnsi="Calibri" w:cs="Calibri"/>
+          <w:b/>
+          <w:bCs/>
+          <w:sz w:val="24"/>
+          <w:szCs w:val="24"/>
+          <w:highlight w:val="yellow"/>
+        </w:rPr>
+        <w:lastRenderedPageBreak/>
+        <w:t>1. Análisis de Modelos Tabulares (Datos Clínicos)</w:t>
+      </w:r>
+    </w:p>
+    <w:p>
+      <w:pPr>
+        <w:spacing w:before="220" w:after="150"/>
+        <w:jc w:val="both"/>
+        <w:rPr>
+          <w:rFonts w:ascii="Calibri" w:eastAsia="Calibri" w:hAnsi="Calibri" w:cs="Calibri"/>
+          <w:sz w:val="24"/>
+          <w:szCs w:val="24"/>
+          <w:highlight w:val="yellow"/>
+        </w:rPr>
+      </w:pPr>
+      <w:r>
+        <w:rPr>
+          <w:rFonts w:ascii="Calibri" w:eastAsia="Calibri" w:hAnsi="Calibri" w:cs="Calibri"/>
+          <w:sz w:val="24"/>
+          <w:szCs w:val="24"/>
+          <w:highlight w:val="yellow"/>
+        </w:rPr>
+        <w:t xml:space="preserve">La evaluación de los modelos de inferencia clínica entrenados sobre el </w:t>
+      </w:r>
+      <w:proofErr w:type="spellStart"/>
+      <w:r>
+        <w:rPr>
+          <w:rFonts w:ascii="Calibri" w:eastAsia="Calibri" w:hAnsi="Calibri" w:cs="Calibri"/>
+          <w:sz w:val="24"/>
+          <w:szCs w:val="24"/>
+          <w:highlight w:val="yellow"/>
+        </w:rPr>
+        <w:t>dataset</w:t>
+      </w:r>
+      <w:proofErr w:type="spellEnd"/>
+      <w:r>
+        <w:rPr>
+          <w:rFonts w:ascii="Calibri" w:eastAsia="Calibri" w:hAnsi="Calibri" w:cs="Calibri"/>
+          <w:sz w:val="24"/>
+          <w:szCs w:val="24"/>
+          <w:highlight w:val="yellow"/>
+        </w:rPr>
+        <w:t xml:space="preserve"> UCI revela un fenómeno denominado "paradoja del </w:t>
+      </w:r>
+      <w:proofErr w:type="spellStart"/>
+      <w:r>
+        <w:rPr>
+          <w:rFonts w:ascii="Calibri" w:eastAsia="Calibri" w:hAnsi="Calibri" w:cs="Calibri"/>
+          <w:sz w:val="24"/>
+          <w:szCs w:val="24"/>
+          <w:highlight w:val="yellow"/>
+        </w:rPr>
+        <w:t>Accuracy</w:t>
+      </w:r>
+      <w:proofErr w:type="spellEnd"/>
+      <w:r>
+        <w:rPr>
+          <w:rFonts w:ascii="Calibri" w:eastAsia="Calibri" w:hAnsi="Calibri" w:cs="Calibri"/>
+          <w:sz w:val="24"/>
+          <w:szCs w:val="24"/>
+          <w:highlight w:val="yellow"/>
+        </w:rPr>
+        <w:t xml:space="preserve">". </w:t>
+      </w:r>
+    </w:p>
+    <w:p>
+      <w:pPr>
+        <w:numPr>
+          <w:ilvl w:val="0"/>
+          <w:numId w:val="5"/>
+        </w:numPr>
+        <w:spacing w:before="220" w:after="150"/>
+        <w:jc w:val="both"/>
+        <w:rPr>
+          <w:rFonts w:ascii="Calibri" w:eastAsia="Calibri" w:hAnsi="Calibri" w:cs="Calibri"/>
+          <w:sz w:val="24"/>
+          <w:szCs w:val="24"/>
+          <w:highlight w:val="yellow"/>
+        </w:rPr>
+      </w:pPr>
+      <w:r>
+        <w:rPr>
+          <w:rFonts w:ascii="Calibri" w:eastAsia="Calibri" w:hAnsi="Calibri" w:cs="Calibri"/>
+          <w:b/>
+          <w:bCs/>
+          <w:sz w:val="24"/>
+          <w:szCs w:val="24"/>
+          <w:highlight w:val="yellow"/>
+        </w:rPr>
+        <w:t>Alta Exactitud, Baja Sensibilidad:</w:t>
+      </w:r>
+      <w:r>
+        <w:rPr>
+          <w:rFonts w:ascii="Calibri" w:eastAsia="Calibri" w:hAnsi="Calibri" w:cs="Calibri"/>
+          <w:sz w:val="24"/>
+          <w:szCs w:val="24"/>
+          <w:highlight w:val="yellow"/>
+        </w:rPr>
+        <w:t xml:space="preserve"> Algoritmos como </w:t>
+      </w:r>
+      <w:proofErr w:type="spellStart"/>
+      <w:r>
+        <w:rPr>
+          <w:rFonts w:ascii="Calibri" w:eastAsia="Calibri" w:hAnsi="Calibri" w:cs="Calibri"/>
+          <w:sz w:val="24"/>
+          <w:szCs w:val="24"/>
+          <w:highlight w:val="yellow"/>
+        </w:rPr>
+        <w:t>XGBoost</w:t>
+      </w:r>
+      <w:proofErr w:type="spellEnd"/>
+      <w:r>
+        <w:rPr>
+          <w:rFonts w:ascii="Calibri" w:eastAsia="Calibri" w:hAnsi="Calibri" w:cs="Calibri"/>
+          <w:sz w:val="24"/>
+          <w:szCs w:val="24"/>
+          <w:highlight w:val="yellow"/>
+        </w:rPr>
+        <w:t xml:space="preserve"> alcanzan una alta Exactitud (</w:t>
+      </w:r>
+      <w:proofErr w:type="spellStart"/>
+      <w:r>
+        <w:rPr>
+          <w:rFonts w:ascii="Calibri" w:eastAsia="Calibri" w:hAnsi="Calibri" w:cs="Calibri"/>
+          <w:sz w:val="24"/>
+          <w:szCs w:val="24"/>
+          <w:highlight w:val="yellow"/>
+        </w:rPr>
+        <w:t>Accuracy</w:t>
+      </w:r>
+      <w:proofErr w:type="spellEnd"/>
+      <w:r>
+        <w:rPr>
+          <w:rFonts w:ascii="Calibri" w:eastAsia="Calibri" w:hAnsi="Calibri" w:cs="Calibri"/>
+          <w:sz w:val="24"/>
+          <w:szCs w:val="24"/>
+          <w:highlight w:val="yellow"/>
+        </w:rPr>
+        <w:t>) del 93.80%. Sin embargo, su Sensibilidad (</w:t>
+      </w:r>
+      <w:proofErr w:type="spellStart"/>
+      <w:r>
+        <w:rPr>
+          <w:rFonts w:ascii="Calibri" w:eastAsia="Calibri" w:hAnsi="Calibri" w:cs="Calibri"/>
+          <w:sz w:val="24"/>
+          <w:szCs w:val="24"/>
+          <w:highlight w:val="yellow"/>
+        </w:rPr>
+        <w:t>Recall</w:t>
+      </w:r>
+      <w:proofErr w:type="spellEnd"/>
+      <w:r>
+        <w:rPr>
+          <w:rFonts w:ascii="Calibri" w:eastAsia="Calibri" w:hAnsi="Calibri" w:cs="Calibri"/>
+          <w:sz w:val="24"/>
+          <w:szCs w:val="24"/>
+          <w:highlight w:val="yellow"/>
+        </w:rPr>
+        <w:t xml:space="preserve">) es críticamente baja, llegando apenas al 12.50%. </w:t>
+      </w:r>
+    </w:p>
+    <w:p>
+      <w:pPr>
+        <w:numPr>
+          <w:ilvl w:val="0"/>
+          <w:numId w:val="5"/>
+        </w:numPr>
+        <w:spacing w:before="220" w:after="150"/>
+        <w:jc w:val="both"/>
+        <w:rPr>
+          <w:rFonts w:ascii="Calibri" w:eastAsia="Calibri" w:hAnsi="Calibri" w:cs="Calibri"/>
+          <w:sz w:val="24"/>
+          <w:szCs w:val="24"/>
+          <w:highlight w:val="yellow"/>
+        </w:rPr>
+      </w:pPr>
+      <w:r>
+        <w:rPr>
+          <w:rFonts w:ascii="Calibri" w:eastAsia="Calibri" w:hAnsi="Calibri" w:cs="Calibri"/>
+          <w:b/>
+          <w:bCs/>
+          <w:sz w:val="24"/>
+          <w:szCs w:val="24"/>
+          <w:highlight w:val="yellow"/>
+        </w:rPr>
+        <w:t>Riesgo Clínico de Falsos Negativos:</w:t>
+      </w:r>
+      <w:r>
+        <w:rPr>
+          <w:rFonts w:ascii="Calibri" w:eastAsia="Calibri" w:hAnsi="Calibri" w:cs="Calibri"/>
+          <w:sz w:val="24"/>
+          <w:szCs w:val="24"/>
+          <w:highlight w:val="yellow"/>
+        </w:rPr>
+        <w:t xml:space="preserve"> Esta disparidad significa que, aunque el modelo acierta en la mayoría de los casos generales, falla sistemáticamente en detectar a las pacientes que realmente presentan riesgo de cáncer. </w:t>
+      </w:r>
+    </w:p>
+    <w:p>
+      <w:pPr>
+        <w:numPr>
+          <w:ilvl w:val="0"/>
+          <w:numId w:val="5"/>
+        </w:numPr>
+        <w:spacing w:before="220" w:after="150"/>
+        <w:jc w:val="both"/>
+        <w:rPr>
+          <w:rFonts w:ascii="Calibri" w:eastAsia="Calibri" w:hAnsi="Calibri" w:cs="Calibri"/>
+          <w:sz w:val="24"/>
+          <w:szCs w:val="24"/>
+          <w:highlight w:val="yellow"/>
+        </w:rPr>
+      </w:pPr>
+      <w:r>
+        <w:rPr>
+          <w:rFonts w:ascii="Calibri" w:eastAsia="Calibri" w:hAnsi="Calibri" w:cs="Calibri"/>
+          <w:b/>
+          <w:bCs/>
+          <w:sz w:val="24"/>
+          <w:szCs w:val="24"/>
+          <w:highlight w:val="yellow"/>
+        </w:rPr>
+        <w:t>Falla del modelo SVM y Random Forest:</w:t>
+      </w:r>
+      <w:r>
+        <w:rPr>
+          <w:rFonts w:ascii="Calibri" w:eastAsia="Calibri" w:hAnsi="Calibri" w:cs="Calibri"/>
+          <w:sz w:val="24"/>
+          <w:szCs w:val="24"/>
+          <w:highlight w:val="yellow"/>
+        </w:rPr>
+        <w:t xml:space="preserve"> Modelos como SVM y Random Forest presentan una especificidad extremadamente alta (97.52% y 95.04% respectivamente), pero una sensibilidad y precisión nulas o casi nulas. Esto indica que están ignorando por completo la clase minoritaria ("enferma") y prediciendo sistemáticamente la clase mayoritaria ("sana"). </w:t>
+      </w:r>
+    </w:p>
+    <w:p>
+      <w:pPr>
+        <w:spacing w:before="220" w:after="150"/>
+        <w:jc w:val="both"/>
+        <w:rPr>
+          <w:rFonts w:ascii="Calibri" w:eastAsia="Calibri" w:hAnsi="Calibri" w:cs="Calibri"/>
+          <w:b/>
+          <w:bCs/>
+          <w:sz w:val="24"/>
+          <w:szCs w:val="24"/>
+          <w:highlight w:val="yellow"/>
+        </w:rPr>
+      </w:pPr>
+      <w:r>
+        <w:rPr>
+          <w:rFonts w:ascii="Calibri" w:eastAsia="Calibri" w:hAnsi="Calibri" w:cs="Calibri"/>
+          <w:b/>
+          <w:bCs/>
+          <w:sz w:val="24"/>
+          <w:szCs w:val="24"/>
+          <w:highlight w:val="yellow"/>
+        </w:rPr>
+        <w:t>2. Análisis de Modelos de Visión por Computadora (Imágenes de Citología)</w:t>
+      </w:r>
+    </w:p>
+    <w:p>
+      <w:pPr>
+        <w:spacing w:before="220" w:after="150"/>
+        <w:jc w:val="both"/>
+        <w:rPr>
+          <w:rFonts w:ascii="Calibri" w:eastAsia="Calibri" w:hAnsi="Calibri" w:cs="Calibri"/>
+          <w:sz w:val="24"/>
+          <w:szCs w:val="24"/>
+          <w:highlight w:val="yellow"/>
+        </w:rPr>
+      </w:pPr>
+      <w:r>
+        <w:rPr>
+          <w:rFonts w:ascii="Calibri" w:eastAsia="Calibri" w:hAnsi="Calibri" w:cs="Calibri"/>
+          <w:sz w:val="24"/>
+          <w:szCs w:val="24"/>
+          <w:highlight w:val="yellow"/>
+        </w:rPr>
+        <w:t xml:space="preserve">El análisis de las Redes Neuronales Convolucionales (CNN) sobre los </w:t>
+      </w:r>
+      <w:proofErr w:type="spellStart"/>
+      <w:r>
+        <w:rPr>
+          <w:rFonts w:ascii="Calibri" w:eastAsia="Calibri" w:hAnsi="Calibri" w:cs="Calibri"/>
+          <w:sz w:val="24"/>
+          <w:szCs w:val="24"/>
+          <w:highlight w:val="yellow"/>
+        </w:rPr>
+        <w:t>datasets</w:t>
+      </w:r>
+      <w:proofErr w:type="spellEnd"/>
+      <w:r>
+        <w:rPr>
+          <w:rFonts w:ascii="Calibri" w:eastAsia="Calibri" w:hAnsi="Calibri" w:cs="Calibri"/>
+          <w:sz w:val="24"/>
+          <w:szCs w:val="24"/>
+          <w:highlight w:val="yellow"/>
+        </w:rPr>
+        <w:t xml:space="preserve"> Herlev, </w:t>
+      </w:r>
+      <w:proofErr w:type="spellStart"/>
+      <w:r>
+        <w:rPr>
+          <w:rFonts w:ascii="Calibri" w:eastAsia="Calibri" w:hAnsi="Calibri" w:cs="Calibri"/>
+          <w:sz w:val="24"/>
+          <w:szCs w:val="24"/>
+          <w:highlight w:val="yellow"/>
+        </w:rPr>
+        <w:t>SIPaKMeD</w:t>
+      </w:r>
+      <w:proofErr w:type="spellEnd"/>
+      <w:r>
+        <w:rPr>
+          <w:rFonts w:ascii="Calibri" w:eastAsia="Calibri" w:hAnsi="Calibri" w:cs="Calibri"/>
+          <w:sz w:val="24"/>
+          <w:szCs w:val="24"/>
+          <w:highlight w:val="yellow"/>
+        </w:rPr>
+        <w:t xml:space="preserve"> y RIVA demuestra comportamientos muy dispares según la arquitectura y el </w:t>
+      </w:r>
+      <w:proofErr w:type="spellStart"/>
+      <w:r>
+        <w:rPr>
+          <w:rFonts w:ascii="Calibri" w:eastAsia="Calibri" w:hAnsi="Calibri" w:cs="Calibri"/>
+          <w:sz w:val="24"/>
+          <w:szCs w:val="24"/>
+          <w:highlight w:val="yellow"/>
+        </w:rPr>
+        <w:t>framework</w:t>
+      </w:r>
+      <w:proofErr w:type="spellEnd"/>
+      <w:r>
+        <w:rPr>
+          <w:rFonts w:ascii="Calibri" w:eastAsia="Calibri" w:hAnsi="Calibri" w:cs="Calibri"/>
+          <w:sz w:val="24"/>
+          <w:szCs w:val="24"/>
+          <w:highlight w:val="yellow"/>
+        </w:rPr>
+        <w:t xml:space="preserve"> utilizado.</w:t>
+      </w:r>
+    </w:p>
+    <w:p>
+      <w:pPr>
+        <w:numPr>
+          <w:ilvl w:val="0"/>
+          <w:numId w:val="6"/>
+        </w:numPr>
+        <w:spacing w:before="220" w:after="150"/>
+        <w:jc w:val="both"/>
+        <w:rPr>
+          <w:rFonts w:ascii="Calibri" w:eastAsia="Calibri" w:hAnsi="Calibri" w:cs="Calibri"/>
+          <w:sz w:val="24"/>
+          <w:szCs w:val="24"/>
+          <w:highlight w:val="yellow"/>
+        </w:rPr>
+      </w:pPr>
+      <w:r>
+        <w:rPr>
+          <w:rFonts w:ascii="Calibri" w:eastAsia="Calibri" w:hAnsi="Calibri" w:cs="Calibri"/>
+          <w:b/>
+          <w:bCs/>
+          <w:sz w:val="24"/>
+          <w:szCs w:val="24"/>
+          <w:highlight w:val="yellow"/>
+        </w:rPr>
+        <w:t xml:space="preserve">Superioridad de </w:t>
+      </w:r>
+      <w:proofErr w:type="spellStart"/>
+      <w:r>
+        <w:rPr>
+          <w:rFonts w:ascii="Calibri" w:eastAsia="Calibri" w:hAnsi="Calibri" w:cs="Calibri"/>
+          <w:b/>
+          <w:bCs/>
+          <w:sz w:val="24"/>
+          <w:szCs w:val="24"/>
+          <w:highlight w:val="yellow"/>
+        </w:rPr>
+        <w:t>AlexNet</w:t>
+      </w:r>
+      <w:proofErr w:type="spellEnd"/>
+      <w:r>
+        <w:rPr>
+          <w:rFonts w:ascii="Calibri" w:eastAsia="Calibri" w:hAnsi="Calibri" w:cs="Calibri"/>
+          <w:b/>
+          <w:bCs/>
+          <w:sz w:val="24"/>
+          <w:szCs w:val="24"/>
+          <w:highlight w:val="yellow"/>
+        </w:rPr>
+        <w:t xml:space="preserve"> (</w:t>
+      </w:r>
+      <w:proofErr w:type="spellStart"/>
+      <w:r>
+        <w:rPr>
+          <w:rFonts w:ascii="Calibri" w:eastAsia="Calibri" w:hAnsi="Calibri" w:cs="Calibri"/>
+          <w:b/>
+          <w:bCs/>
+          <w:sz w:val="24"/>
+          <w:szCs w:val="24"/>
+          <w:highlight w:val="yellow"/>
+        </w:rPr>
+        <w:t>PyTorch</w:t>
+      </w:r>
+      <w:proofErr w:type="spellEnd"/>
+      <w:r>
+        <w:rPr>
+          <w:rFonts w:ascii="Calibri" w:eastAsia="Calibri" w:hAnsi="Calibri" w:cs="Calibri"/>
+          <w:b/>
+          <w:bCs/>
+          <w:sz w:val="24"/>
+          <w:szCs w:val="24"/>
+          <w:highlight w:val="yellow"/>
+        </w:rPr>
+        <w:t>):</w:t>
+      </w:r>
+      <w:r>
+        <w:rPr>
+          <w:rFonts w:ascii="Calibri" w:eastAsia="Calibri" w:hAnsi="Calibri" w:cs="Calibri"/>
+          <w:sz w:val="24"/>
+          <w:szCs w:val="24"/>
+          <w:highlight w:val="yellow"/>
+        </w:rPr>
+        <w:t xml:space="preserve"> La arquitectura </w:t>
+      </w:r>
+      <w:proofErr w:type="spellStart"/>
+      <w:r>
+        <w:rPr>
+          <w:rFonts w:ascii="Calibri" w:eastAsia="Calibri" w:hAnsi="Calibri" w:cs="Calibri"/>
+          <w:sz w:val="24"/>
+          <w:szCs w:val="24"/>
+          <w:highlight w:val="yellow"/>
+        </w:rPr>
+        <w:t>AlexNet</w:t>
+      </w:r>
+      <w:proofErr w:type="spellEnd"/>
+      <w:r>
+        <w:rPr>
+          <w:rFonts w:ascii="Calibri" w:eastAsia="Calibri" w:hAnsi="Calibri" w:cs="Calibri"/>
+          <w:sz w:val="24"/>
+          <w:szCs w:val="24"/>
+          <w:highlight w:val="yellow"/>
+        </w:rPr>
+        <w:t xml:space="preserve"> demostró ser la red con mejor convergencia y desempeño general. Logró coronarse como el modelo definitivo en el </w:t>
+      </w:r>
+      <w:proofErr w:type="spellStart"/>
+      <w:r>
+        <w:rPr>
+          <w:rFonts w:ascii="Calibri" w:eastAsia="Calibri" w:hAnsi="Calibri" w:cs="Calibri"/>
+          <w:sz w:val="24"/>
+          <w:szCs w:val="24"/>
+          <w:highlight w:val="yellow"/>
+        </w:rPr>
+        <w:t>dataset</w:t>
+      </w:r>
+      <w:proofErr w:type="spellEnd"/>
+      <w:r>
+        <w:rPr>
+          <w:rFonts w:ascii="Calibri" w:eastAsia="Calibri" w:hAnsi="Calibri" w:cs="Calibri"/>
+          <w:sz w:val="24"/>
+          <w:szCs w:val="24"/>
+          <w:highlight w:val="yellow"/>
+        </w:rPr>
+        <w:t xml:space="preserve"> </w:t>
+      </w:r>
+      <w:proofErr w:type="spellStart"/>
+      <w:r>
+        <w:rPr>
+          <w:rFonts w:ascii="Calibri" w:eastAsia="Calibri" w:hAnsi="Calibri" w:cs="Calibri"/>
+          <w:sz w:val="24"/>
+          <w:szCs w:val="24"/>
+          <w:highlight w:val="yellow"/>
+        </w:rPr>
+        <w:t>SIPaKMeD</w:t>
+      </w:r>
+      <w:proofErr w:type="spellEnd"/>
+      <w:r>
+        <w:rPr>
+          <w:rFonts w:ascii="Calibri" w:eastAsia="Calibri" w:hAnsi="Calibri" w:cs="Calibri"/>
+          <w:sz w:val="24"/>
+          <w:szCs w:val="24"/>
+          <w:highlight w:val="yellow"/>
+        </w:rPr>
+        <w:t xml:space="preserve">, alcanzando una Exactitud del 93.63% y un AUC-ROC del 99.65%. En el </w:t>
+      </w:r>
+      <w:proofErr w:type="spellStart"/>
+      <w:r>
+        <w:rPr>
+          <w:rFonts w:ascii="Calibri" w:eastAsia="Calibri" w:hAnsi="Calibri" w:cs="Calibri"/>
+          <w:sz w:val="24"/>
+          <w:szCs w:val="24"/>
+          <w:highlight w:val="yellow"/>
+        </w:rPr>
+        <w:t>dataset</w:t>
+      </w:r>
+      <w:proofErr w:type="spellEnd"/>
+      <w:r>
+        <w:rPr>
+          <w:rFonts w:ascii="Calibri" w:eastAsia="Calibri" w:hAnsi="Calibri" w:cs="Calibri"/>
+          <w:sz w:val="24"/>
+          <w:szCs w:val="24"/>
+          <w:highlight w:val="yellow"/>
+        </w:rPr>
+        <w:t xml:space="preserve"> RIVA mantuvo un rendimiento sobresaliente con una Exactitud del 92.83% y un AUC-ROC del 99.47%. </w:t>
+      </w:r>
+    </w:p>
+    <w:p>
+      <w:pPr>
+        <w:numPr>
+          <w:ilvl w:val="0"/>
+          <w:numId w:val="6"/>
+        </w:numPr>
+        <w:spacing w:before="220" w:after="150"/>
+        <w:jc w:val="both"/>
+        <w:rPr>
+          <w:rFonts w:ascii="Calibri" w:eastAsia="Calibri" w:hAnsi="Calibri" w:cs="Calibri"/>
+          <w:sz w:val="24"/>
+          <w:szCs w:val="24"/>
+          <w:highlight w:val="yellow"/>
+        </w:rPr>
+      </w:pPr>
+      <w:r>
+        <w:rPr>
+          <w:rFonts w:ascii="Calibri" w:eastAsia="Calibri" w:hAnsi="Calibri" w:cs="Calibri"/>
+          <w:b/>
+          <w:bCs/>
+          <w:sz w:val="24"/>
+          <w:szCs w:val="24"/>
+          <w:highlight w:val="yellow"/>
+        </w:rPr>
+        <w:t xml:space="preserve">Rendimiento Moderado de </w:t>
+      </w:r>
+      <w:proofErr w:type="spellStart"/>
+      <w:r>
+        <w:rPr>
+          <w:rFonts w:ascii="Calibri" w:eastAsia="Calibri" w:hAnsi="Calibri" w:cs="Calibri"/>
+          <w:b/>
+          <w:bCs/>
+          <w:sz w:val="24"/>
+          <w:szCs w:val="24"/>
+          <w:highlight w:val="yellow"/>
+        </w:rPr>
+        <w:t>MobileNet</w:t>
+      </w:r>
+      <w:proofErr w:type="spellEnd"/>
+      <w:r>
+        <w:rPr>
+          <w:rFonts w:ascii="Calibri" w:eastAsia="Calibri" w:hAnsi="Calibri" w:cs="Calibri"/>
+          <w:b/>
+          <w:bCs/>
+          <w:sz w:val="24"/>
+          <w:szCs w:val="24"/>
+          <w:highlight w:val="yellow"/>
+        </w:rPr>
+        <w:t xml:space="preserve"> e InceptionV3:</w:t>
+      </w:r>
+      <w:r>
+        <w:rPr>
+          <w:rFonts w:ascii="Calibri" w:eastAsia="Calibri" w:hAnsi="Calibri" w:cs="Calibri"/>
+          <w:sz w:val="24"/>
+          <w:szCs w:val="24"/>
+          <w:highlight w:val="yellow"/>
+        </w:rPr>
+        <w:t xml:space="preserve"> En el entorno </w:t>
+      </w:r>
+      <w:proofErr w:type="spellStart"/>
+      <w:r>
+        <w:rPr>
+          <w:rFonts w:ascii="Calibri" w:eastAsia="Calibri" w:hAnsi="Calibri" w:cs="Calibri"/>
+          <w:sz w:val="24"/>
+          <w:szCs w:val="24"/>
+          <w:highlight w:val="yellow"/>
+        </w:rPr>
+        <w:t>Keras</w:t>
+      </w:r>
+      <w:proofErr w:type="spellEnd"/>
+      <w:r>
+        <w:rPr>
+          <w:rFonts w:ascii="Calibri" w:eastAsia="Calibri" w:hAnsi="Calibri" w:cs="Calibri"/>
+          <w:sz w:val="24"/>
+          <w:szCs w:val="24"/>
+          <w:highlight w:val="yellow"/>
+        </w:rPr>
+        <w:t xml:space="preserve">, </w:t>
+      </w:r>
+      <w:proofErr w:type="spellStart"/>
+      <w:r>
+        <w:rPr>
+          <w:rFonts w:ascii="Calibri" w:eastAsia="Calibri" w:hAnsi="Calibri" w:cs="Calibri"/>
+          <w:sz w:val="24"/>
+          <w:szCs w:val="24"/>
+          <w:highlight w:val="yellow"/>
+        </w:rPr>
+        <w:t>MobileNet</w:t>
+      </w:r>
+      <w:proofErr w:type="spellEnd"/>
+      <w:r>
+        <w:rPr>
+          <w:rFonts w:ascii="Calibri" w:eastAsia="Calibri" w:hAnsi="Calibri" w:cs="Calibri"/>
+          <w:sz w:val="24"/>
+          <w:szCs w:val="24"/>
+          <w:highlight w:val="yellow"/>
+        </w:rPr>
+        <w:t xml:space="preserve"> e InceptionV3 demostraron estabilidad en su entrenamiento, pero se estancaron en exactitudes moderadas. InceptionV3 logró un 49.35% en </w:t>
+      </w:r>
+      <w:proofErr w:type="spellStart"/>
+      <w:r>
+        <w:rPr>
+          <w:rFonts w:ascii="Calibri" w:eastAsia="Calibri" w:hAnsi="Calibri" w:cs="Calibri"/>
+          <w:sz w:val="24"/>
+          <w:szCs w:val="24"/>
+          <w:highlight w:val="yellow"/>
+        </w:rPr>
+        <w:t>SIPaKMeD</w:t>
+      </w:r>
+      <w:proofErr w:type="spellEnd"/>
+      <w:r>
+        <w:rPr>
+          <w:rFonts w:ascii="Calibri" w:eastAsia="Calibri" w:hAnsi="Calibri" w:cs="Calibri"/>
+          <w:sz w:val="24"/>
+          <w:szCs w:val="24"/>
+          <w:highlight w:val="yellow"/>
+        </w:rPr>
+        <w:t xml:space="preserve"> y un 47.55% en RIVA, mientras que </w:t>
+      </w:r>
+      <w:proofErr w:type="spellStart"/>
+      <w:r>
+        <w:rPr>
+          <w:rFonts w:ascii="Calibri" w:eastAsia="Calibri" w:hAnsi="Calibri" w:cs="Calibri"/>
+          <w:sz w:val="24"/>
+          <w:szCs w:val="24"/>
+          <w:highlight w:val="yellow"/>
+        </w:rPr>
+        <w:t>MobileNet</w:t>
+      </w:r>
+      <w:proofErr w:type="spellEnd"/>
+      <w:r>
+        <w:rPr>
+          <w:rFonts w:ascii="Calibri" w:eastAsia="Calibri" w:hAnsi="Calibri" w:cs="Calibri"/>
+          <w:sz w:val="24"/>
+          <w:szCs w:val="24"/>
+          <w:highlight w:val="yellow"/>
+        </w:rPr>
+        <w:t xml:space="preserve"> se mantuvo en el rango del 40-42% en la mayoría de los escenarios. </w:t>
+      </w:r>
+    </w:p>
+    <w:p>
+      <w:pPr>
+        <w:numPr>
+          <w:ilvl w:val="0"/>
+          <w:numId w:val="6"/>
+        </w:numPr>
+        <w:spacing w:before="220" w:after="150"/>
+        <w:jc w:val="both"/>
+        <w:rPr>
+          <w:rFonts w:ascii="Calibri" w:eastAsia="Calibri" w:hAnsi="Calibri" w:cs="Calibri"/>
+          <w:sz w:val="24"/>
+          <w:szCs w:val="24"/>
+          <w:highlight w:val="yellow"/>
+        </w:rPr>
+      </w:pPr>
+      <w:r>
+        <w:rPr>
+          <w:rFonts w:ascii="Calibri" w:eastAsia="Calibri" w:hAnsi="Calibri" w:cs="Calibri"/>
+          <w:b/>
+          <w:bCs/>
+          <w:sz w:val="24"/>
+          <w:szCs w:val="24"/>
+          <w:highlight w:val="yellow"/>
+        </w:rPr>
+        <w:t>Deficiencia Arquitectónica en ResNet50:</w:t>
+      </w:r>
+      <w:r>
+        <w:rPr>
+          <w:rFonts w:ascii="Calibri" w:eastAsia="Calibri" w:hAnsi="Calibri" w:cs="Calibri"/>
+          <w:sz w:val="24"/>
+          <w:szCs w:val="24"/>
+          <w:highlight w:val="yellow"/>
+        </w:rPr>
+        <w:t xml:space="preserve"> El modelo ResNet50 presentó un colapso prematuro durante el entrenamiento, siendo detenido por el mecanismo de </w:t>
+      </w:r>
+      <w:r>
+        <w:rPr>
+          <w:rFonts w:ascii="Calibri" w:eastAsia="Calibri" w:hAnsi="Calibri" w:cs="Calibri"/>
+          <w:i/>
+          <w:iCs/>
+          <w:sz w:val="24"/>
+          <w:szCs w:val="24"/>
+          <w:highlight w:val="yellow"/>
+        </w:rPr>
+        <w:t xml:space="preserve">Early </w:t>
+      </w:r>
+      <w:proofErr w:type="spellStart"/>
+      <w:r>
+        <w:rPr>
+          <w:rFonts w:ascii="Calibri" w:eastAsia="Calibri" w:hAnsi="Calibri" w:cs="Calibri"/>
+          <w:i/>
+          <w:iCs/>
+          <w:sz w:val="24"/>
+          <w:szCs w:val="24"/>
+          <w:highlight w:val="yellow"/>
+        </w:rPr>
+        <w:t>Stopping</w:t>
+      </w:r>
+      <w:proofErr w:type="spellEnd"/>
+      <w:r>
+        <w:rPr>
+          <w:rFonts w:ascii="Calibri" w:eastAsia="Calibri" w:hAnsi="Calibri" w:cs="Calibri"/>
+          <w:sz w:val="24"/>
+          <w:szCs w:val="24"/>
+          <w:highlight w:val="yellow"/>
+        </w:rPr>
+        <w:t xml:space="preserve"> en etapas muy tempranas (época 6). Esto limitó severamente su rendimiento, dejándolo con exactitudes deficientes como el 33.17% en </w:t>
+      </w:r>
+      <w:proofErr w:type="spellStart"/>
+      <w:r>
+        <w:rPr>
+          <w:rFonts w:ascii="Calibri" w:eastAsia="Calibri" w:hAnsi="Calibri" w:cs="Calibri"/>
+          <w:sz w:val="24"/>
+          <w:szCs w:val="24"/>
+          <w:highlight w:val="yellow"/>
+        </w:rPr>
+        <w:t>SIPaKMeD</w:t>
+      </w:r>
+      <w:proofErr w:type="spellEnd"/>
+      <w:r>
+        <w:rPr>
+          <w:rFonts w:ascii="Calibri" w:eastAsia="Calibri" w:hAnsi="Calibri" w:cs="Calibri"/>
+          <w:sz w:val="24"/>
+          <w:szCs w:val="24"/>
+          <w:highlight w:val="yellow"/>
+        </w:rPr>
+        <w:t xml:space="preserve"> y el 16.79% en Herlev. Este comportamiento sugiere que congelar las capas densas base impidió la correcta extracción de características morfológicas del tejido cervical. </w:t>
+      </w:r>
+    </w:p>
+    <w:p>
+      <w:pPr>
+        <w:spacing w:before="220" w:after="150"/>
+        <w:jc w:val="both"/>
+        <w:rPr>
+          <w:rFonts w:ascii="Calibri" w:eastAsia="Calibri" w:hAnsi="Calibri" w:cs="Calibri"/>
+          <w:b/>
+          <w:bCs/>
+          <w:sz w:val="24"/>
+          <w:szCs w:val="24"/>
+          <w:highlight w:val="yellow"/>
+        </w:rPr>
+      </w:pPr>
+      <w:r>
+        <w:rPr>
+          <w:rFonts w:ascii="Calibri" w:eastAsia="Calibri" w:hAnsi="Calibri" w:cs="Calibri"/>
+          <w:b/>
+          <w:bCs/>
+          <w:sz w:val="24"/>
+          <w:szCs w:val="24"/>
+          <w:highlight w:val="yellow"/>
+        </w:rPr>
+        <w:t>3. Conclusiones y Recomendaciones</w:t>
+      </w:r>
+    </w:p>
+    <w:p>
+      <w:pPr>
+        <w:numPr>
+          <w:ilvl w:val="0"/>
+          <w:numId w:val="7"/>
+        </w:numPr>
+        <w:spacing w:before="220" w:after="150"/>
+        <w:jc w:val="both"/>
+        <w:rPr>
+          <w:rFonts w:ascii="Calibri" w:eastAsia="Calibri" w:hAnsi="Calibri" w:cs="Calibri"/>
+          <w:sz w:val="24"/>
+          <w:szCs w:val="24"/>
+          <w:highlight w:val="yellow"/>
+        </w:rPr>
+      </w:pPr>
+      <w:r>
+        <w:rPr>
+          <w:rFonts w:ascii="Calibri" w:eastAsia="Calibri" w:hAnsi="Calibri" w:cs="Calibri"/>
+          <w:b/>
+          <w:bCs/>
+          <w:sz w:val="24"/>
+          <w:szCs w:val="24"/>
+          <w:highlight w:val="yellow"/>
+        </w:rPr>
+        <w:lastRenderedPageBreak/>
+        <w:t>Ajuste de Umbrales Clínicos:</w:t>
+      </w:r>
+      <w:r>
+        <w:rPr>
+          <w:rFonts w:ascii="Calibri" w:eastAsia="Calibri" w:hAnsi="Calibri" w:cs="Calibri"/>
+          <w:sz w:val="24"/>
+          <w:szCs w:val="24"/>
+          <w:highlight w:val="yellow"/>
+        </w:rPr>
+        <w:t xml:space="preserve"> Dado que modelos como </w:t>
+      </w:r>
+      <w:proofErr w:type="spellStart"/>
+      <w:r>
+        <w:rPr>
+          <w:rFonts w:ascii="Calibri" w:eastAsia="Calibri" w:hAnsi="Calibri" w:cs="Calibri"/>
+          <w:sz w:val="24"/>
+          <w:szCs w:val="24"/>
+          <w:highlight w:val="yellow"/>
+        </w:rPr>
+        <w:t>XGBoost</w:t>
+      </w:r>
+      <w:proofErr w:type="spellEnd"/>
+      <w:r>
+        <w:rPr>
+          <w:rFonts w:ascii="Calibri" w:eastAsia="Calibri" w:hAnsi="Calibri" w:cs="Calibri"/>
+          <w:sz w:val="24"/>
+          <w:szCs w:val="24"/>
+          <w:highlight w:val="yellow"/>
+        </w:rPr>
+        <w:t xml:space="preserve"> logran un AUC-ROC decente (75.41%), es imperativo ajustar el umbral de decisión (</w:t>
+      </w:r>
+      <w:proofErr w:type="spellStart"/>
+      <w:r>
+        <w:rPr>
+          <w:rFonts w:ascii="Calibri" w:eastAsia="Calibri" w:hAnsi="Calibri" w:cs="Calibri"/>
+          <w:i/>
+          <w:iCs/>
+          <w:sz w:val="24"/>
+          <w:szCs w:val="24"/>
+          <w:highlight w:val="yellow"/>
+        </w:rPr>
+        <w:t>threshold</w:t>
+      </w:r>
+      <w:proofErr w:type="spellEnd"/>
+      <w:r>
+        <w:rPr>
+          <w:rFonts w:ascii="Calibri" w:eastAsia="Calibri" w:hAnsi="Calibri" w:cs="Calibri"/>
+          <w:sz w:val="24"/>
+          <w:szCs w:val="24"/>
+          <w:highlight w:val="yellow"/>
+        </w:rPr>
+        <w:t xml:space="preserve">) clínico para tolerar un mayor número de falsos positivos a cambio de mejorar drásticamente la captura de verdaderos positivos (sensibilidad). </w:t>
+      </w:r>
+    </w:p>
+    <w:p>
+      <w:pPr>
+        <w:numPr>
+          <w:ilvl w:val="0"/>
+          <w:numId w:val="7"/>
+        </w:numPr>
+        <w:spacing w:before="220" w:after="150"/>
+        <w:jc w:val="both"/>
+        <w:rPr>
+          <w:rFonts w:ascii="Calibri" w:eastAsia="Calibri" w:hAnsi="Calibri" w:cs="Calibri"/>
+          <w:sz w:val="24"/>
+          <w:szCs w:val="24"/>
+          <w:highlight w:val="yellow"/>
+        </w:rPr>
+      </w:pPr>
+      <w:r>
+        <w:rPr>
+          <w:rFonts w:ascii="Calibri" w:eastAsia="Calibri" w:hAnsi="Calibri" w:cs="Calibri"/>
+          <w:b/>
+          <w:bCs/>
+          <w:sz w:val="24"/>
+          <w:szCs w:val="24"/>
+          <w:highlight w:val="yellow"/>
+        </w:rPr>
+        <w:t xml:space="preserve">Fine-Tuning para </w:t>
+      </w:r>
+      <w:proofErr w:type="spellStart"/>
+      <w:r>
+        <w:rPr>
+          <w:rFonts w:ascii="Calibri" w:eastAsia="Calibri" w:hAnsi="Calibri" w:cs="Calibri"/>
+          <w:b/>
+          <w:bCs/>
+          <w:sz w:val="24"/>
+          <w:szCs w:val="24"/>
+          <w:highlight w:val="yellow"/>
+        </w:rPr>
+        <w:t>Keras</w:t>
+      </w:r>
+      <w:proofErr w:type="spellEnd"/>
+      <w:r>
+        <w:rPr>
+          <w:rFonts w:ascii="Calibri" w:eastAsia="Calibri" w:hAnsi="Calibri" w:cs="Calibri"/>
+          <w:b/>
+          <w:bCs/>
+          <w:sz w:val="24"/>
+          <w:szCs w:val="24"/>
+          <w:highlight w:val="yellow"/>
+        </w:rPr>
+        <w:t>:</w:t>
+      </w:r>
+      <w:r>
+        <w:rPr>
+          <w:rFonts w:ascii="Calibri" w:eastAsia="Calibri" w:hAnsi="Calibri" w:cs="Calibri"/>
+          <w:sz w:val="24"/>
+          <w:szCs w:val="24"/>
+          <w:highlight w:val="yellow"/>
+        </w:rPr>
+        <w:t xml:space="preserve"> Para arquitecturas como </w:t>
+      </w:r>
+      <w:proofErr w:type="spellStart"/>
+      <w:r>
+        <w:rPr>
+          <w:rFonts w:ascii="Calibri" w:eastAsia="Calibri" w:hAnsi="Calibri" w:cs="Calibri"/>
+          <w:sz w:val="24"/>
+          <w:szCs w:val="24"/>
+          <w:highlight w:val="yellow"/>
+        </w:rPr>
+        <w:t>MobileNet</w:t>
+      </w:r>
+      <w:proofErr w:type="spellEnd"/>
+      <w:r>
+        <w:rPr>
+          <w:rFonts w:ascii="Calibri" w:eastAsia="Calibri" w:hAnsi="Calibri" w:cs="Calibri"/>
+          <w:sz w:val="24"/>
+          <w:szCs w:val="24"/>
+          <w:highlight w:val="yellow"/>
+        </w:rPr>
+        <w:t xml:space="preserve"> e InceptionV3, se recomienda no solo entrenar las últimas capas densas, sino descongelar un porcentaje de sus capas base superiores para realizar un re-entrenamiento más profundo y mejorar así su capacidad de clasificar las imágenes.</w:t>
+      </w:r>
+    </w:p>
+    <w:p>
+      <w:pPr>
+        <w:spacing w:before="220" w:after="150"/>
+        <w:jc w:val="both"/>
+        <w:rPr>
+          <w:rFonts w:ascii="Calibri" w:eastAsia="Calibri" w:hAnsi="Calibri" w:cs="Calibri"/>
+          <w:sz w:val="24"/>
+          <w:szCs w:val="24"/>
+        </w:rPr>
+      </w:pPr>
+    </w:p>
+    <w:p>
+      <w:pPr>
+        <w:spacing w:before="220" w:after="150"/>
         <w:jc w:val="center"/>
-      </w:pPr>
-      <w:r>
         <w:rPr>
           <w:rFonts w:ascii="Calibri" w:eastAsia="Calibri" w:hAnsi="Calibri" w:cs="Calibri"/>
           <w:b/>
@@ -12096,7 +13043,21 @@
           <w:sz w:val="32"/>
           <w:szCs w:val="32"/>
         </w:rPr>
-        <w:lastRenderedPageBreak/>
+      </w:pPr>
+    </w:p>
+    <w:p>
+      <w:pPr>
+        <w:spacing w:before="220" w:after="150"/>
+        <w:jc w:val="center"/>
+      </w:pPr>
+      <w:r>
+        <w:rPr>
+          <w:rFonts w:ascii="Calibri" w:eastAsia="Calibri" w:hAnsi="Calibri" w:cs="Calibri"/>
+          <w:b/>
+          <w:bCs/>
+          <w:sz w:val="32"/>
+          <w:szCs w:val="32"/>
+        </w:rPr>
         <w:t>ANÁLISIS DE EXPLICABILIDAD DE LOS ALGORITMOS</w:t>
       </w:r>
     </w:p>
@@ -13499,7 +14460,16 @@
           <w:sz w:val="24"/>
           <w:szCs w:val="24"/>
         </w:rPr>
-        <w:t xml:space="preserve"> ofrecen un equilibrio entre rendimiento y </w:t>
+        <w:t xml:space="preserve"> ofrecen un </w:t>
+      </w:r>
+      <w:r>
+        <w:rPr>
+          <w:rFonts w:ascii="Calibri" w:eastAsia="Calibri" w:hAnsi="Calibri" w:cs="Calibri"/>
+          <w:sz w:val="24"/>
+          <w:szCs w:val="24"/>
+        </w:rPr>
+        <w:lastRenderedPageBreak/>
+        <w:t xml:space="preserve">equilibrio entre rendimiento y </w:t>
       </w:r>
       <w:proofErr w:type="spellStart"/>
       <w:r>
@@ -13705,16 +14675,7 @@
           <w:sz w:val="24"/>
           <w:szCs w:val="24"/>
         </w:rPr>
-        <w:t xml:space="preserve"> o CNN) son prioritarios, complementados con herramientas XAI para la auditoría de casos límite. Para el apoyo a la decisión clínica individual, modelos interpretables (como árboles de decisión o regresión logística) pueden ser preferibles, ya que </w:t>
-      </w:r>
-      <w:r>
-        <w:rPr>
-          <w:rFonts w:ascii="Calibri" w:eastAsia="Calibri" w:hAnsi="Calibri" w:cs="Calibri"/>
-          <w:sz w:val="24"/>
-          <w:szCs w:val="24"/>
-        </w:rPr>
-        <w:lastRenderedPageBreak/>
-        <w:t>facilitan la comprensión y aceptación por parte del personal médico</w:t>
+        <w:t xml:space="preserve"> o CNN) son prioritarios, complementados con herramientas XAI para la auditoría de casos límite. Para el apoyo a la decisión clínica individual, modelos interpretables (como árboles de decisión o regresión logística) pueden ser preferibles, ya que facilitan la comprensión y aceptación por parte del personal médico</w:t>
       </w:r>
       <w:r>
         <w:rPr>
@@ -14098,7 +15059,16 @@
           <w:sz w:val="24"/>
           <w:szCs w:val="24"/>
         </w:rPr>
-        <w:t xml:space="preserve"> mediante métricas como la fidelidad de las explicaciones y el impacto en la confianza del usuario. Adicionalmente, se explorará la integración de mecanismos Human-in-</w:t>
+        <w:t xml:space="preserve"> mediante métricas como la fidelidad de las </w:t>
+      </w:r>
+      <w:r>
+        <w:rPr>
+          <w:rFonts w:ascii="Calibri" w:eastAsia="Calibri" w:hAnsi="Calibri" w:cs="Calibri"/>
+          <w:sz w:val="24"/>
+          <w:szCs w:val="24"/>
+        </w:rPr>
+        <w:lastRenderedPageBreak/>
+        <w:t>explicaciones y el impacto en la confianza del usuario. Adicionalmente, se explorará la integración de mecanismos Human-in-</w:t>
       </w:r>
       <w:proofErr w:type="spellStart"/>
       <w:r>
@@ -14194,7 +15164,6 @@
           <w:sz w:val="18"/>
           <w:szCs w:val="18"/>
         </w:rPr>
-        <w:lastRenderedPageBreak/>
         <w:t xml:space="preserve">[1] H. Sung, J. </w:t>
       </w:r>
       <w:proofErr w:type="spellStart"/>
@@ -14567,25 +15536,7 @@
           <w:sz w:val="18"/>
           <w:szCs w:val="18"/>
         </w:rPr>
-        <w:t xml:space="preserve"> </w:t>
-      </w:r>
-      <w:proofErr w:type="spellStart"/>
-      <w:r>
-        <w:rPr>
-          <w:rFonts w:ascii="Calibri" w:eastAsia="Calibri" w:hAnsi="Calibri" w:cs="Calibri"/>
-          <w:sz w:val="18"/>
-          <w:szCs w:val="18"/>
-        </w:rPr>
-        <w:t>is</w:t>
-      </w:r>
-      <w:proofErr w:type="spellEnd"/>
-      <w:r>
-        <w:rPr>
-          <w:rFonts w:ascii="Calibri" w:eastAsia="Calibri" w:hAnsi="Calibri" w:cs="Calibri"/>
-          <w:sz w:val="18"/>
-          <w:szCs w:val="18"/>
-        </w:rPr>
-        <w:t xml:space="preserve"> a </w:t>
+        <w:t xml:space="preserve"> is a </w:t>
       </w:r>
       <w:proofErr w:type="spellStart"/>
       <w:r>
@@ -18080,6 +19031,7 @@
           <w:sz w:val="18"/>
           <w:szCs w:val="18"/>
         </w:rPr>
+        <w:lastRenderedPageBreak/>
         <w:t xml:space="preserve">[20] K. He, X. Zhang, S. Ren, and J. </w:t>
       </w:r>
       <w:proofErr w:type="spellStart"/>
@@ -19961,7 +20913,6 @@
           <w:sz w:val="18"/>
           <w:szCs w:val="18"/>
         </w:rPr>
-        <w:lastRenderedPageBreak/>
         <w:t>[29] "</w:t>
       </w:r>
       <w:proofErr w:type="spellStart"/>
@@ -21949,6 +22900,304 @@
 <file path=word/numbering.xml><?xml version="1.0" encoding="utf-8"?>
 <w:numbering xmlns:wpc="http://schemas.microsoft.com/office/word/2010/wordprocessingCanvas" xmlns:cx="http://schemas.microsoft.com/office/drawing/2014/chartex" xmlns:cx1="http://schemas.microsoft.com/office/drawing/2015/9/8/chartex" xmlns:cx2="http://schemas.microsoft.com/office/drawing/2015/10/21/chartex" xmlns:cx3="http://schemas.microsoft.com/office/drawing/2016/5/9/chartex" xmlns:cx4="http://schemas.microsoft.com/office/drawing/2016/5/10/chartex" xmlns:cx5="http://schemas.microsoft.com/office/drawing/2016/5/11/chartex" xmlns:cx6="http://schemas.microsoft.com/office/drawing/2016/5/12/chartex" xmlns:cx7="http://schemas.microsoft.com/office/drawing/2016/5/13/chartex" xmlns:cx8="http://schemas.microsoft.com/office/drawing/2016/5/14/chartex" xmlns:mc="http://schemas.openxmlformats.org/markup-compatibility/2006" xmlns:m="http://schemas.openxmlformats.org/officeDocument/2006/math" xmlns:aink="http://schemas.microsoft.com/office/drawing/2016/ink" xmlns:am3d="http://schemas.microsoft.com/office/drawing/2017/model3d" xmlns:oel="http://schemas.microsoft.com/office/2019/extlst" xmlns:r="http://schemas.openxmlformats.org/officeDocument/2006/relationships" xmlns:wp14="http://schemas.microsoft.com/office/word/2010/wordprocessingDrawing" xmlns:wp="http://schemas.openxmlformats.org/drawingml/2006/wordprocessingDrawing" xmlns:wpg="http://schemas.microsoft.com/office/word/2010/wordprocessingGroup" xmlns:wpi="http://schemas.microsoft.com/office/word/2010/wordprocessingInk" xmlns:wps="http://schemas.microsoft.com/office/word/2010/wordprocessingShape" xmlns:o="urn:schemas-microsoft-com:office:office" xmlns:v="urn:schemas-microsoft-com:vml" xmlns:w10="urn:schemas-microsoft-com:office:word" xmlns:w="http://schemas.openxmlformats.org/wordprocessingml/2006/main" xmlns:w14="http://schemas.microsoft.com/office/word/2010/wordml" xmlns:w15="http://schemas.microsoft.com/office/word/2012/wordml" xmlns:w16cex="http://schemas.microsoft.com/office/word/2018/wordml/cex" xmlns:w16cid="http://schemas.microsoft.com/office/word/2016/wordml/cid" xmlns:w16="http://schemas.microsoft.com/office/word/2018/wordml" xmlns:w16sdtdh="http://schemas.microsoft.com/office/word/2020/wordml/sdtdatahash" xmlns:w16sdtfl="http://schemas.microsoft.com/office/word/2024/wordml/sdtformatlock" xmlns:w16se="http://schemas.microsoft.com/office/word/2015/wordml/symex" xmlns:w16du="http://schemas.microsoft.com/office/word/2023/wordml/word16du" xmlns:wne="http://schemas.microsoft.com/office/word/2006/wordml" mc:Ignorable="w14 w15 w16se w16cid w16 w16cex w16sdtdh w16sdtfl w16du wp14">
   <w:abstractNum w:abstractNumId="0" w15:restartNumberingAfterBreak="0">
+    <w:nsid w:val="07EC228B"/>
+    <w:multiLevelType w:val="multilevel"/>
+    <w:tmpl w:val="B5B444A8"/>
+    <w:lvl w:ilvl="0">
+      <w:start w:val="1"/>
+      <w:numFmt w:val="bullet"/>
+      <w:lvlText w:val=""/>
+      <w:lvlJc w:val="left"/>
+      <w:pPr>
+        <w:tabs>
+          <w:tab w:val="num" w:pos="720"/>
+        </w:tabs>
+        <w:ind w:left="720" w:hanging="360"/>
+      </w:pPr>
+      <w:rPr>
+        <w:rFonts w:ascii="Symbol" w:hAnsi="Symbol" w:hint="default"/>
+        <w:sz w:val="20"/>
+      </w:rPr>
+    </w:lvl>
+    <w:lvl w:ilvl="1" w:tentative="1">
+      <w:start w:val="1"/>
+      <w:numFmt w:val="bullet"/>
+      <w:lvlText w:val="o"/>
+      <w:lvlJc w:val="left"/>
+      <w:pPr>
+        <w:tabs>
+          <w:tab w:val="num" w:pos="1440"/>
+        </w:tabs>
+        <w:ind w:left="1440" w:hanging="360"/>
+      </w:pPr>
+      <w:rPr>
+        <w:rFonts w:ascii="Courier New" w:hAnsi="Courier New" w:hint="default"/>
+        <w:sz w:val="20"/>
+      </w:rPr>
+    </w:lvl>
+    <w:lvl w:ilvl="2" w:tentative="1">
+      <w:start w:val="1"/>
+      <w:numFmt w:val="bullet"/>
+      <w:lvlText w:val=""/>
+      <w:lvlJc w:val="left"/>
+      <w:pPr>
+        <w:tabs>
+          <w:tab w:val="num" w:pos="2160"/>
+        </w:tabs>
+        <w:ind w:left="2160" w:hanging="360"/>
+      </w:pPr>
+      <w:rPr>
+        <w:rFonts w:ascii="Wingdings" w:hAnsi="Wingdings" w:hint="default"/>
+        <w:sz w:val="20"/>
+      </w:rPr>
+    </w:lvl>
+    <w:lvl w:ilvl="3" w:tentative="1">
+      <w:start w:val="1"/>
+      <w:numFmt w:val="bullet"/>
+      <w:lvlText w:val=""/>
+      <w:lvlJc w:val="left"/>
+      <w:pPr>
+        <w:tabs>
+          <w:tab w:val="num" w:pos="2880"/>
+        </w:tabs>
+        <w:ind w:left="2880" w:hanging="360"/>
+      </w:pPr>
+      <w:rPr>
+        <w:rFonts w:ascii="Wingdings" w:hAnsi="Wingdings" w:hint="default"/>
+        <w:sz w:val="20"/>
+      </w:rPr>
+    </w:lvl>
+    <w:lvl w:ilvl="4" w:tentative="1">
+      <w:start w:val="1"/>
+      <w:numFmt w:val="bullet"/>
+      <w:lvlText w:val=""/>
+      <w:lvlJc w:val="left"/>
+      <w:pPr>
+        <w:tabs>
+          <w:tab w:val="num" w:pos="3600"/>
+        </w:tabs>
+        <w:ind w:left="3600" w:hanging="360"/>
+      </w:pPr>
+      <w:rPr>
+        <w:rFonts w:ascii="Wingdings" w:hAnsi="Wingdings" w:hint="default"/>
+        <w:sz w:val="20"/>
+      </w:rPr>
+    </w:lvl>
+    <w:lvl w:ilvl="5" w:tentative="1">
+      <w:start w:val="1"/>
+      <w:numFmt w:val="bullet"/>
+      <w:lvlText w:val=""/>
+      <w:lvlJc w:val="left"/>
+      <w:pPr>
+        <w:tabs>
+          <w:tab w:val="num" w:pos="4320"/>
+        </w:tabs>
+        <w:ind w:left="4320" w:hanging="360"/>
+      </w:pPr>
+      <w:rPr>
+        <w:rFonts w:ascii="Wingdings" w:hAnsi="Wingdings" w:hint="default"/>
+        <w:sz w:val="20"/>
+      </w:rPr>
+    </w:lvl>
+    <w:lvl w:ilvl="6" w:tentative="1">
+      <w:start w:val="1"/>
+      <w:numFmt w:val="bullet"/>
+      <w:lvlText w:val=""/>
+      <w:lvlJc w:val="left"/>
+      <w:pPr>
+        <w:tabs>
+          <w:tab w:val="num" w:pos="5040"/>
+        </w:tabs>
+        <w:ind w:left="5040" w:hanging="360"/>
+      </w:pPr>
+      <w:rPr>
+        <w:rFonts w:ascii="Wingdings" w:hAnsi="Wingdings" w:hint="default"/>
+        <w:sz w:val="20"/>
+      </w:rPr>
+    </w:lvl>
+    <w:lvl w:ilvl="7" w:tentative="1">
+      <w:start w:val="1"/>
+      <w:numFmt w:val="bullet"/>
+      <w:lvlText w:val=""/>
+      <w:lvlJc w:val="left"/>
+      <w:pPr>
+        <w:tabs>
+          <w:tab w:val="num" w:pos="5760"/>
+        </w:tabs>
+        <w:ind w:left="5760" w:hanging="360"/>
+      </w:pPr>
+      <w:rPr>
+        <w:rFonts w:ascii="Wingdings" w:hAnsi="Wingdings" w:hint="default"/>
+        <w:sz w:val="20"/>
+      </w:rPr>
+    </w:lvl>
+    <w:lvl w:ilvl="8" w:tentative="1">
+      <w:start w:val="1"/>
+      <w:numFmt w:val="bullet"/>
+      <w:lvlText w:val=""/>
+      <w:lvlJc w:val="left"/>
+      <w:pPr>
+        <w:tabs>
+          <w:tab w:val="num" w:pos="6480"/>
+        </w:tabs>
+        <w:ind w:left="6480" w:hanging="360"/>
+      </w:pPr>
+      <w:rPr>
+        <w:rFonts w:ascii="Wingdings" w:hAnsi="Wingdings" w:hint="default"/>
+        <w:sz w:val="20"/>
+      </w:rPr>
+    </w:lvl>
+  </w:abstractNum>
+  <w:abstractNum w:abstractNumId="1" w15:restartNumberingAfterBreak="0">
+    <w:nsid w:val="0B8B746A"/>
+    <w:multiLevelType w:val="multilevel"/>
+    <w:tmpl w:val="ACBE97CE"/>
+    <w:lvl w:ilvl="0">
+      <w:start w:val="1"/>
+      <w:numFmt w:val="bullet"/>
+      <w:lvlText w:val=""/>
+      <w:lvlJc w:val="left"/>
+      <w:pPr>
+        <w:tabs>
+          <w:tab w:val="num" w:pos="720"/>
+        </w:tabs>
+        <w:ind w:left="720" w:hanging="360"/>
+      </w:pPr>
+      <w:rPr>
+        <w:rFonts w:ascii="Symbol" w:hAnsi="Symbol" w:hint="default"/>
+        <w:sz w:val="20"/>
+      </w:rPr>
+    </w:lvl>
+    <w:lvl w:ilvl="1" w:tentative="1">
+      <w:start w:val="1"/>
+      <w:numFmt w:val="bullet"/>
+      <w:lvlText w:val="o"/>
+      <w:lvlJc w:val="left"/>
+      <w:pPr>
+        <w:tabs>
+          <w:tab w:val="num" w:pos="1440"/>
+        </w:tabs>
+        <w:ind w:left="1440" w:hanging="360"/>
+      </w:pPr>
+      <w:rPr>
+        <w:rFonts w:ascii="Courier New" w:hAnsi="Courier New" w:hint="default"/>
+        <w:sz w:val="20"/>
+      </w:rPr>
+    </w:lvl>
+    <w:lvl w:ilvl="2" w:tentative="1">
+      <w:start w:val="1"/>
+      <w:numFmt w:val="bullet"/>
+      <w:lvlText w:val=""/>
+      <w:lvlJc w:val="left"/>
+      <w:pPr>
+        <w:tabs>
+          <w:tab w:val="num" w:pos="2160"/>
+        </w:tabs>
+        <w:ind w:left="2160" w:hanging="360"/>
+      </w:pPr>
+      <w:rPr>
+        <w:rFonts w:ascii="Wingdings" w:hAnsi="Wingdings" w:hint="default"/>
+        <w:sz w:val="20"/>
+      </w:rPr>
+    </w:lvl>
+    <w:lvl w:ilvl="3" w:tentative="1">
+      <w:start w:val="1"/>
+      <w:numFmt w:val="bullet"/>
+      <w:lvlText w:val=""/>
+      <w:lvlJc w:val="left"/>
+      <w:pPr>
+        <w:tabs>
+          <w:tab w:val="num" w:pos="2880"/>
+        </w:tabs>
+        <w:ind w:left="2880" w:hanging="360"/>
+      </w:pPr>
+      <w:rPr>
+        <w:rFonts w:ascii="Wingdings" w:hAnsi="Wingdings" w:hint="default"/>
+        <w:sz w:val="20"/>
+      </w:rPr>
+    </w:lvl>
+    <w:lvl w:ilvl="4" w:tentative="1">
+      <w:start w:val="1"/>
+      <w:numFmt w:val="bullet"/>
+      <w:lvlText w:val=""/>
+      <w:lvlJc w:val="left"/>
+      <w:pPr>
+        <w:tabs>
+          <w:tab w:val="num" w:pos="3600"/>
+        </w:tabs>
+        <w:ind w:left="3600" w:hanging="360"/>
+      </w:pPr>
+      <w:rPr>
+        <w:rFonts w:ascii="Wingdings" w:hAnsi="Wingdings" w:hint="default"/>
+        <w:sz w:val="20"/>
+      </w:rPr>
+    </w:lvl>
+    <w:lvl w:ilvl="5" w:tentative="1">
+      <w:start w:val="1"/>
+      <w:numFmt w:val="bullet"/>
+      <w:lvlText w:val=""/>
+      <w:lvlJc w:val="left"/>
+      <w:pPr>
+        <w:tabs>
+          <w:tab w:val="num" w:pos="4320"/>
+        </w:tabs>
+        <w:ind w:left="4320" w:hanging="360"/>
+      </w:pPr>
+      <w:rPr>
+        <w:rFonts w:ascii="Wingdings" w:hAnsi="Wingdings" w:hint="default"/>
+        <w:sz w:val="20"/>
+      </w:rPr>
+    </w:lvl>
+    <w:lvl w:ilvl="6" w:tentative="1">
+      <w:start w:val="1"/>
+      <w:numFmt w:val="bullet"/>
+      <w:lvlText w:val=""/>
+      <w:lvlJc w:val="left"/>
+      <w:pPr>
+        <w:tabs>
+          <w:tab w:val="num" w:pos="5040"/>
+        </w:tabs>
+        <w:ind w:left="5040" w:hanging="360"/>
+      </w:pPr>
+      <w:rPr>
+        <w:rFonts w:ascii="Wingdings" w:hAnsi="Wingdings" w:hint="default"/>
+        <w:sz w:val="20"/>
+      </w:rPr>
+    </w:lvl>
+    <w:lvl w:ilvl="7" w:tentative="1">
+      <w:start w:val="1"/>
+      <w:numFmt w:val="bullet"/>
+      <w:lvlText w:val=""/>
+      <w:lvlJc w:val="left"/>
+      <w:pPr>
+        <w:tabs>
+          <w:tab w:val="num" w:pos="5760"/>
+        </w:tabs>
+        <w:ind w:left="5760" w:hanging="360"/>
+      </w:pPr>
+      <w:rPr>
+        <w:rFonts w:ascii="Wingdings" w:hAnsi="Wingdings" w:hint="default"/>
+        <w:sz w:val="20"/>
+      </w:rPr>
+    </w:lvl>
+    <w:lvl w:ilvl="8" w:tentative="1">
+      <w:start w:val="1"/>
+      <w:numFmt w:val="bullet"/>
+      <w:lvlText w:val=""/>
+      <w:lvlJc w:val="left"/>
+      <w:pPr>
+        <w:tabs>
+          <w:tab w:val="num" w:pos="6480"/>
+        </w:tabs>
+        <w:ind w:left="6480" w:hanging="360"/>
+      </w:pPr>
+      <w:rPr>
+        <w:rFonts w:ascii="Wingdings" w:hAnsi="Wingdings" w:hint="default"/>
+        <w:sz w:val="20"/>
+      </w:rPr>
+    </w:lvl>
+  </w:abstractNum>
+  <w:abstractNum w:abstractNumId="2" w15:restartNumberingAfterBreak="0">
     <w:nsid w:val="0D4540E8"/>
     <w:multiLevelType w:val="hybridMultilevel"/>
     <w:tmpl w:val="80D03022"/>
@@ -22034,7 +23283,7 @@
       </w:pPr>
     </w:lvl>
   </w:abstractNum>
-  <w:abstractNum w:abstractNumId="1" w15:restartNumberingAfterBreak="0">
+  <w:abstractNum w:abstractNumId="3" w15:restartNumberingAfterBreak="0">
     <w:nsid w:val="1FDC6883"/>
     <w:multiLevelType w:val="multilevel"/>
     <w:tmpl w:val="910E6480"/>
@@ -22151,7 +23400,7 @@
       </w:pPr>
     </w:lvl>
   </w:abstractNum>
-  <w:abstractNum w:abstractNumId="2" w15:restartNumberingAfterBreak="0">
+  <w:abstractNum w:abstractNumId="4" w15:restartNumberingAfterBreak="0">
     <w:nsid w:val="32E96263"/>
     <w:multiLevelType w:val="multilevel"/>
     <w:tmpl w:val="8A14B81A"/>
@@ -22264,7 +23513,7 @@
       </w:pPr>
     </w:lvl>
   </w:abstractNum>
-  <w:abstractNum w:abstractNumId="3" w15:restartNumberingAfterBreak="0">
+  <w:abstractNum w:abstractNumId="5" w15:restartNumberingAfterBreak="0">
     <w:nsid w:val="6C3D2DF9"/>
     <w:multiLevelType w:val="multilevel"/>
     <w:tmpl w:val="D23E235C"/>
@@ -22413,20 +23662,178 @@
       </w:rPr>
     </w:lvl>
   </w:abstractNum>
+  <w:abstractNum w:abstractNumId="6" w15:restartNumberingAfterBreak="0">
+    <w:nsid w:val="7B1B1E31"/>
+    <w:multiLevelType w:val="multilevel"/>
+    <w:tmpl w:val="0CBE22E6"/>
+    <w:lvl w:ilvl="0">
+      <w:start w:val="1"/>
+      <w:numFmt w:val="bullet"/>
+      <w:lvlText w:val=""/>
+      <w:lvlJc w:val="left"/>
+      <w:pPr>
+        <w:tabs>
+          <w:tab w:val="num" w:pos="720"/>
+        </w:tabs>
+        <w:ind w:left="720" w:hanging="360"/>
+      </w:pPr>
+      <w:rPr>
+        <w:rFonts w:ascii="Symbol" w:hAnsi="Symbol" w:hint="default"/>
+        <w:sz w:val="20"/>
+      </w:rPr>
+    </w:lvl>
+    <w:lvl w:ilvl="1" w:tentative="1">
+      <w:start w:val="1"/>
+      <w:numFmt w:val="bullet"/>
+      <w:lvlText w:val="o"/>
+      <w:lvlJc w:val="left"/>
+      <w:pPr>
+        <w:tabs>
+          <w:tab w:val="num" w:pos="1440"/>
+        </w:tabs>
+        <w:ind w:left="1440" w:hanging="360"/>
+      </w:pPr>
+      <w:rPr>
+        <w:rFonts w:ascii="Courier New" w:hAnsi="Courier New" w:hint="default"/>
+        <w:sz w:val="20"/>
+      </w:rPr>
+    </w:lvl>
+    <w:lvl w:ilvl="2" w:tentative="1">
+      <w:start w:val="1"/>
+      <w:numFmt w:val="bullet"/>
+      <w:lvlText w:val=""/>
+      <w:lvlJc w:val="left"/>
+      <w:pPr>
+        <w:tabs>
+          <w:tab w:val="num" w:pos="2160"/>
+        </w:tabs>
+        <w:ind w:left="2160" w:hanging="360"/>
+      </w:pPr>
+      <w:rPr>
+        <w:rFonts w:ascii="Wingdings" w:hAnsi="Wingdings" w:hint="default"/>
+        <w:sz w:val="20"/>
+      </w:rPr>
+    </w:lvl>
+    <w:lvl w:ilvl="3" w:tentative="1">
+      <w:start w:val="1"/>
+      <w:numFmt w:val="bullet"/>
+      <w:lvlText w:val=""/>
+      <w:lvlJc w:val="left"/>
+      <w:pPr>
+        <w:tabs>
+          <w:tab w:val="num" w:pos="2880"/>
+        </w:tabs>
+        <w:ind w:left="2880" w:hanging="360"/>
+      </w:pPr>
+      <w:rPr>
+        <w:rFonts w:ascii="Wingdings" w:hAnsi="Wingdings" w:hint="default"/>
+        <w:sz w:val="20"/>
+      </w:rPr>
+    </w:lvl>
+    <w:lvl w:ilvl="4" w:tentative="1">
+      <w:start w:val="1"/>
+      <w:numFmt w:val="bullet"/>
+      <w:lvlText w:val=""/>
+      <w:lvlJc w:val="left"/>
+      <w:pPr>
+        <w:tabs>
+          <w:tab w:val="num" w:pos="3600"/>
+        </w:tabs>
+        <w:ind w:left="3600" w:hanging="360"/>
+      </w:pPr>
+      <w:rPr>
+        <w:rFonts w:ascii="Wingdings" w:hAnsi="Wingdings" w:hint="default"/>
+        <w:sz w:val="20"/>
+      </w:rPr>
+    </w:lvl>
+    <w:lvl w:ilvl="5" w:tentative="1">
+      <w:start w:val="1"/>
+      <w:numFmt w:val="bullet"/>
+      <w:lvlText w:val=""/>
+      <w:lvlJc w:val="left"/>
+      <w:pPr>
+        <w:tabs>
+          <w:tab w:val="num" w:pos="4320"/>
+        </w:tabs>
+        <w:ind w:left="4320" w:hanging="360"/>
+      </w:pPr>
+      <w:rPr>
+        <w:rFonts w:ascii="Wingdings" w:hAnsi="Wingdings" w:hint="default"/>
+        <w:sz w:val="20"/>
+      </w:rPr>
+    </w:lvl>
+    <w:lvl w:ilvl="6" w:tentative="1">
+      <w:start w:val="1"/>
+      <w:numFmt w:val="bullet"/>
+      <w:lvlText w:val=""/>
+      <w:lvlJc w:val="left"/>
+      <w:pPr>
+        <w:tabs>
+          <w:tab w:val="num" w:pos="5040"/>
+        </w:tabs>
+        <w:ind w:left="5040" w:hanging="360"/>
+      </w:pPr>
+      <w:rPr>
+        <w:rFonts w:ascii="Wingdings" w:hAnsi="Wingdings" w:hint="default"/>
+        <w:sz w:val="20"/>
+      </w:rPr>
+    </w:lvl>
+    <w:lvl w:ilvl="7" w:tentative="1">
+      <w:start w:val="1"/>
+      <w:numFmt w:val="bullet"/>
+      <w:lvlText w:val=""/>
+      <w:lvlJc w:val="left"/>
+      <w:pPr>
+        <w:tabs>
+          <w:tab w:val="num" w:pos="5760"/>
+        </w:tabs>
+        <w:ind w:left="5760" w:hanging="360"/>
+      </w:pPr>
+      <w:rPr>
+        <w:rFonts w:ascii="Wingdings" w:hAnsi="Wingdings" w:hint="default"/>
+        <w:sz w:val="20"/>
+      </w:rPr>
+    </w:lvl>
+    <w:lvl w:ilvl="8" w:tentative="1">
+      <w:start w:val="1"/>
+      <w:numFmt w:val="bullet"/>
+      <w:lvlText w:val=""/>
+      <w:lvlJc w:val="left"/>
+      <w:pPr>
+        <w:tabs>
+          <w:tab w:val="num" w:pos="6480"/>
+        </w:tabs>
+        <w:ind w:left="6480" w:hanging="360"/>
+      </w:pPr>
+      <w:rPr>
+        <w:rFonts w:ascii="Wingdings" w:hAnsi="Wingdings" w:hint="default"/>
+        <w:sz w:val="20"/>
+      </w:rPr>
+    </w:lvl>
+  </w:abstractNum>
   <w:num w:numId="1" w16cid:durableId="607156576">
-    <w:abstractNumId w:val="0"/>
+    <w:abstractNumId w:val="2"/>
     <w:lvlOverride w:ilvl="0">
       <w:startOverride w:val="1"/>
     </w:lvlOverride>
   </w:num>
   <w:num w:numId="2" w16cid:durableId="2086150065">
+    <w:abstractNumId w:val="5"/>
+  </w:num>
+  <w:num w:numId="3" w16cid:durableId="1994941864">
     <w:abstractNumId w:val="3"/>
   </w:num>
-  <w:num w:numId="3" w16cid:durableId="1994941864">
+  <w:num w:numId="4" w16cid:durableId="942762186">
+    <w:abstractNumId w:val="4"/>
+  </w:num>
+  <w:num w:numId="5" w16cid:durableId="805856529">
     <w:abstractNumId w:val="1"/>
   </w:num>
-  <w:num w:numId="4" w16cid:durableId="942762186">
-    <w:abstractNumId w:val="2"/>
+  <w:num w:numId="6" w16cid:durableId="795880083">
+    <w:abstractNumId w:val="0"/>
+  </w:num>
+  <w:num w:numId="7" w16cid:durableId="421145504">
+    <w:abstractNumId w:val="6"/>
   </w:num>
 </w:numbering>
 </file>

</xml_diff>